<commit_message>
Revise report prose and strengthen chemical engineering analysis
</commit_message>
<xml_diff>
--- a/deliverables/医用抗菌水凝胶_课程报告.docx
+++ b/deliverables/医用抗菌水凝胶_课程报告.docx
@@ -52,7 +52,7 @@
     </w:p>
     <w:p>
       <w:r>
-        <w:t>创面敷料不只是覆盖损伤表面的材料，还参与水分管理、微生物控制和局部界面维持。敷料的适用性取决于创面深度、部位、渗出液、组织状态及换药条件。慢性创面尤其需要考虑感染、持续炎症和局部微环境异常之间的联系，因此不能仅依据一种体外抑菌指标选择材料。相关综述也将敷料的屏障作用、保湿、吸收渗出液以及支持组织修复作为相互关联的设计要求。</w:t>
+        <w:t>创面敷料需要把水分管理、微生物控制和组织界面维持放在一起考虑。高渗出液创面要求材料吸收液体后仍能保持覆盖，活动部位要求敷料随皮肤形变而不易脱落，慢性创面还涉及感染与持续炎症。选择材料时，首先要弄清它承担哪一项主要任务。相关综述将屏障、保湿、吸液和支持组织修复列为相互关联的设计要求。</w:t>
       </w:r>
       <w:r>
         <w:rPr>
@@ -65,7 +65,7 @@
     </w:p>
     <w:p>
       <w:r>
-        <w:t>水凝胶由亲水高分子构成三维网络，能够容纳水及活性组分，其柔顺性和可调结构为敷料设计提供了空间。抗菌功能既可来自基体或固定化基团，也可来自负载药物、金属相关组分以及光响应体系。不过，水凝胶不是一个具有统一性能的材料类别：聚合物、交联方式、负载顺序和制品形态均会改变最终行为。“水凝胶具有抗菌性”这一概括，必须进一步落实到具体配方和作用条件。</w:t>
+        <w:t>水凝胶的亲水高分子网络既是敷料骨架，也是水和活性组分的传递介质。抗菌功能可来自基体或固定化基团，也可来自负载药物、金属相关组分及光响应体系。相同的活性成分装入不同网络后，释放速度、接触机会和湿态稳定性都可能发生变化；只比较成分名称，很难解释这些差别。</w:t>
       </w:r>
       <w:r>
         <w:rPr>
@@ -78,7 +78,7 @@
     </w:p>
     <w:p>
       <w:r>
-        <w:t>从化工角度看，制备工艺与抗菌作用之间存在一条可分析的联系：加工条件决定网络及组分分布，网络影响液体交换和有效成分的可及性，作用过程又受到创面环境制约。只罗列原料名称难以解释性能差异，而只罗列抗菌率也会忽略传质、吸液和使用过程。本报告据此采用“工艺—结构—机制—性能”的主线，兼顾原料选择、反应控制和制品成型。</w:t>
+        <w:t>本报告沿“工艺—结构—机制—性能”的主线展开。重点关注原料怎样成网、功能组分放在何处、成型怎样影响传质，以及这些因素如何共同决定敷料的使用表现。从化工角度看，配方设计和加工过程需要连起来分析：一种材料即使在小样上表现良好，改变混合顺序、制品厚度或后处理方式，也可能得到不同的成品。</w:t>
       </w:r>
       <w:r>
         <w:rPr>
@@ -91,7 +91,7 @@
     </w:p>
     <w:p>
       <w:r>
-        <w:t>本报告为主题性叙述综述，不是系统综述或荟萃分析。检索于2026年10月6日进行，使用PubMed、Europe PMC及Crossref，以hydrogel、wound、antibacterial、antimicrobial为核心词，并补充self-healing、adhesive、biofilm、photothermal、photodynamic及3D printing相关检索。数据库命中记录不直接等于纳入研究；Crossref主要用于补充发现和书目信息核对。本稿围绕主题选用2021—2025年的20篇英文文献，其中8篇综述、12篇原始研究，并另列1篇相关更正。原始研究的材料组成、关键方法和相关结果与公开全文对照，不把未阅读全文或未经核对的信息补写为实验结论。</w:t>
+        <w:t>本报告采用主题性叙述综述。检索于2026年10月6日进行，使用PubMed、Europe PMC及Crossref，以hydrogel、wound、antibacterial、antimicrobial为核心词，补充self-healing、adhesive、biofilm、photothermal、photodynamic及3D printing相关检索。选取2021—2025年的20篇英文文献，其中8篇综述、12篇原始研究，另附1篇相关更正。书目信息与Crossref记录核对，材料组成、方法和结果与公开全文对照。</w:t>
       </w:r>
     </w:p>
     <w:p>
@@ -112,7 +112,7 @@
     </w:p>
     <w:p>
       <w:r>
-        <w:t>原料选择需要同时考虑成网条件、功能实现及加工稳定性。天然来源高分子可以提供氨基、羟基或羧基等反应和相互作用位点，合成高分子则提供另一类结构和官能化设计空间；两者都不能仅凭来源证明最终材料安全。原料分子结构、改性程度、残余杂质和批次差异应纳入评价。以壳聚糖为例，其溶解和抗菌行为与分子量、脱乙酰程度及环境条件有关，母体原料的性质不能直接转移到任意衍生物和复合敷料。</w:t>
+        <w:t>选原料首先要看它能否在预定条件下溶解、混合和成网。壳聚糖含有氨基和羟基，既能参与交联，也具有进一步改性的空间；其溶解和抗菌行为与分子量、脱乙酰程度及环境条件有关。因而，同样写作“壳聚糖水凝胶”的配方，前驱液黏度、混合难度和最终功能未必接近。天然来源本身也不能代替对残余杂质和批次差异的控制。</w:t>
       </w:r>
       <w:r>
         <w:rPr>
@@ -125,7 +125,7 @@
     </w:p>
     <w:p>
       <w:r>
-        <w:t>含氨基聚合物能够参与某些动态共价交联，但参与反应后，剩余官能团及局部电荷状态可能改变。对于同时依赖这些基团实现界面作用的材料，交联并非与功能无关的“固定步骤”。因此，工艺讨论应说明官能团如何用于成网、还有哪些结构承担抗菌或黏附任务，以及改性是否改变组分传递。该判断是对材料设计逻辑的分析，具体影响仍须由同一配方体系中的表征和对照验证。</w:t>
+        <w:t>值得关注的是官能团的分配。氨基用于与醛基形成席夫碱后，可供其他作用的游离氨基随之改变；改性还可能改变局部电荷和水合状态。对于同时依靠这些基团成网和抗菌的体系，增加交联剂不能只看成胶是否更快，还应检查网络中的功能位点是否仍然可及。与其把交联看成一道固定工序，不如把成网位点、抗菌位点和界面作用位点分别列清楚，再决定各组分的配比。</w:t>
       </w:r>
     </w:p>
     <w:p>
@@ -138,7 +138,7 @@
     </w:p>
     <w:p>
       <w:r>
-        <w:t>物理交联通过非共价相互作用或物理结构约束形成网络。对于聚乙烯醇（PVA）体系，冻融等路线涉及氢键、结晶区域及链段相互作用，其工艺变量包括溶液组成和温度处理过程。PVA水凝胶综述讨论了冻融、盐析等构筑方法；聚合物敷料综述还指出，部分PVA复合体系中，改变聚合物含量或冻融次数会同时改变溶胀与力学行为。该关系应限定于相应体系，不能作为所有水凝胶的统一规律。</w:t>
+        <w:t>PVA冻融成胶的特点是利用链间氢键和结晶区域形成物理交联点。冻结过程改变局部聚合物浓度，链段更容易靠近；解冻后保留下来的结晶区域为网络提供约束。由此可见，冻融次数不是孤立参数，它还要与聚合物浓度及温度处理过程一起考虑。有关综述讨论了冻融、盐析等路线，并指出部分PVA复合体系中，聚合物含量或冻融次数的变化会同时影响溶胀和力学行为。</w:t>
       </w:r>
       <w:r>
         <w:rPr>
@@ -151,7 +151,7 @@
     </w:p>
     <w:p>
       <w:r>
-        <w:t>物理路线的一个设计动机是减少某些反应性小分子的使用，但“没有共价交联剂”不等于“没有安全性问题”。复合活性成分、离子或可浸出杂质仍需检验。与此同时，物理作用可能受到离子、温度和液体环境影响；对创面敷料，应考察吸液后的网络完整性，而不能只检查刚制成的样品。材料在储存、施用和换药时是否保持预期结构，是工艺比较的重要组成部分。</w:t>
+        <w:t>这条路线减少了某些反应性小分子的使用，但生产上仍要付出温度循环和处理时间。对敷料而言，关键问题是物理交联点在吸液后能否支撑网络：吸水有利于液体管理，却也会稀释局部链段和界面基团。工艺筛选时，应把干态或初始强度与浸泡后的形状保持并列考察。复合体系还需检查可浸出成分，尤其是后续加入的活性物质和离子。</w:t>
       </w:r>
     </w:p>
     <w:p>
@@ -164,7 +164,7 @@
     </w:p>
     <w:p>
       <w:r>
-        <w:t>化学交联便于构建具有明确组成和结构的网络，但转化程度、残余物与后处理必须同时考虑。Yang Y等以功能化壳聚糖、甲基丙烯酰胺多巴胺和锌离子构建光交联敷料，其制备方法报告使用365 nm紫外光照射15 s进行交联。这两个参数来自该研究的具体前驱液和实验条件，不能转化为通用的成胶规范。光源、光引发剂、厚度和组分配比应共同进入工艺记录。</w:t>
+        <w:t>光引发交联把反应启动与成型位置联系起来。Yang Y等采用功能化壳聚糖、甲基丙烯酰胺多巴胺和锌离子构建敷料，前驱液中的可聚合结构在光引发条件下形成网络。其方法报告使用365 nm紫外光照射15 s；这是该配方的照射步骤，不宜直接称为任意体系的成胶时间。壳聚糖衍生物参与成网，多巴胺相关结构承担黏附与抗氧化设计，锌相关组分用于抗菌。</w:t>
       </w:r>
       <w:r>
         <w:rPr>
@@ -177,7 +177,7 @@
     </w:p>
     <w:p>
       <w:r>
-        <w:t>该体系中，壳聚糖衍生物提供可聚合结构，多巴胺相关组分参与界面黏附与抗氧化设计，锌相关组分用于抗菌功能。研究在细胞及血液相容性测试、止血模型和MRSA感染的全层皮肤缺损模型中评价材料。其意义在于将反应构筑与功能分工联系起来，而不是证明“光交联材料均能治疗耐药菌感染”。残余反应物、照射对组织的影响及更大面积成型的一致性，仍需在拟应用条件下进一步验证。</w:t>
+        <w:t>这一工艺最需要控制的是光照和反应的均匀性。小试薄层较容易受光，制品增厚后，光穿透和组分吸收可能使内外层的转化程度不同。放大时应同时记录前驱液配比、引发剂、光源条件和厚度，并检查残余反应物及后处理效果。该研究进行了细胞、血液相容性、止血及MRSA感染全层皮肤缺损模型评价，为配方的功能分工提供了依据；工艺上下一步应关注的是如何稳定得到相同的网络，而不只是把照射时间保持不变。</w:t>
       </w:r>
       <w:r>
         <w:rPr>
@@ -198,7 +198,7 @@
     </w:p>
     <w:p>
       <w:r>
-        <w:t>动态共价键和配位作用提供了网络重新组织的途径。Qiao等采用多巴胺接枝的氧化海藻酸钠、羧甲基壳聚糖和Fe³⁺构建席夫碱与金属配位双动态网络，并引入聚多巴胺包覆的聚噻吩乙酸组分，形成兼具自修复、导电和光热作用的水凝胶。研究评价了流变、黏附、抗氧化和止血性能，并在小鼠感染创面模型中检验修复相关结果。这里“自修复”与“导电”属于不同功能，不能仅凭它们同时存在就认定某一个功能独立导致了创面改善。</w:t>
+        <w:t>动态网络的特点是受力或界面接触变化后，部分连接能够重新组织。Qiao等以多巴胺接枝的氧化海藻酸钠、羧甲基壳聚糖和Fe³⁺构建席夫碱与金属配位双动态网络，并引入聚多巴胺包覆的聚噻吩乙酸组分。前两类连接提供网络重组的途径，复合组分则带来导电和光热功能。研究同时评价流变、黏附、抗氧化、止血及小鼠感染创面修复，体现了网络设计与使用任务的结合。</w:t>
       </w:r>
       <w:r>
         <w:rPr>
@@ -211,7 +211,7 @@
     </w:p>
     <w:p>
       <w:r>
-        <w:t>Deng等针对感染烧伤构建PVA-没食子酸、苯硼酸改性海藻酸钠和Zn²⁺组成的网络，并引入壳聚糖包覆的冰片纳米颗粒。动态硼酸酯、配位和氢键共同参与成网；其评价还包括小鼠烧伤模型中的疼痛相关行为，而不仅是体外抗菌。这说明工艺设计可以围绕特定创面需求展开。但动物行为指标不是患者主观疼痛结果，尚不能据此认定该敷料具有确定的临床镇痛疗效。</w:t>
+        <w:t>Deng等将PVA-没食子酸、苯硼酸改性海藻酸钠和Zn²⁺组合，并加入壳聚糖包覆的冰片纳米颗粒。动态硼酸酯、配位和氢键共同参与成网。与一般感染创面研究相比，该工作还考察了小鼠感染烧伤模型的疼痛相关行为，使配方设计更贴近烧伤情境。</w:t>
       </w:r>
       <w:r>
         <w:rPr>
@@ -224,7 +224,7 @@
     </w:p>
     <w:p>
       <w:r>
-        <w:t>动态网络的价值，应通过重复形变、浸泡及功能保持来讨论。将断开的样品重新接合可以证明某些恢复行为，但不必然覆盖实际创面反复运动后的可靠性。成胶、自修复、形状保持和组分迁移之间是否存在权衡，应由测试条件解释，避免把“动态”当作适用性的保证。</w:t>
+        <w:t>动态连接也带来一个工艺上的矛盾：连接容易重排，有利于注射、贴合和破损恢复；但重排过快，可能影响长期承载和形状保持。对此，断裂样品重新接合的演示还不够，流变恢复、持续受力后的变形，以及浸泡和反复运动后的功能保持更有分析价值。网络调整的目标应是让它在加工时能流动、施用后能稳定覆盖，两阶段的要求并不相同。</w:t>
       </w:r>
     </w:p>
     <w:p>
@@ -237,7 +237,7 @@
     </w:p>
     <w:p>
       <w:r>
-        <w:t>复合增强不是简单向既有水凝胶添加填料。Yang Z等将细菌纤维素表面接枝的聚二烯丙基二甲基氯化铵刷状结构引入聚多巴胺/聚丙烯酰胺体系。纤维骨架参与力学增强，阳离子聚合物结构参与抗菌作用，儿茶酚基团参与黏附。研究报告不同配方的拉伸强度为21–51 kPa，同时进行了细胞和大鼠创面评价。该数值只能用于描述其测试体系，不能据此宣称其优于所有其他敷料。</w:t>
+        <w:t>复合组分是否有效，取决于它在网络里承担什么角色。Yang Z等把细菌纤维素表面接枝的聚二烯丙基二甲基氯化铵刷状结构引入聚多巴胺/聚丙烯酰胺体系。纤维骨架提供增强结构，表面阳离子聚合物用于抗菌，儿茶酚基团参与黏附。这种安排把承载结构和表面功能结合起来。论文报告不同配方的拉伸强度为21–51 kPa，并进行了细胞和大鼠创面评价。</w:t>
       </w:r>
       <w:r>
         <w:rPr>
@@ -250,7 +250,7 @@
     </w:p>
     <w:p>
       <w:r>
-        <w:t>三维打印将结构成型纳入设计，但要求墨水兼具挤出流动性与沉积后支撑能力。Zhou等的综述归纳了水凝胶打印敷料的工艺和应用；Chen等则用埃洛石纳米管增强壳聚糖墨水，通过氢键和静电作用改善流变及结构保持，并负载左氧氟沙星用于抗菌。在该原始研究中，打印、药物传递、血液及细胞相容性和小鼠感染创面共同构成评价链条。打印提供了结构自由度，但不能替代对配方和最终制品的验证。</w:t>
+        <w:t>三维打印则把问题转向流变与沉积。墨水黏度太低，挤出后的结构容易失去支撑；黏度过高，又增加挤出难度。剪切变稀使墨水在喷嘴内较易流动，沉积后的恢复能力决定它能否保持形状。Chen等利用埃洛石纳米管与壳聚糖之间的氢键和静电作用改善墨水流变及结构保持，并负载左氧氟沙星。结合打印敷料综述来看，原料分散、挤出和后续结构稳定应作为连续的加工过程控制，不能只看打印图形是否清晰。</w:t>
       </w:r>
       <w:r>
         <w:rPr>
@@ -263,7 +263,7 @@
     </w:p>
     <w:p>
       <w:r>
-        <w:t>表1从工艺角度归纳上述路线。各路线的限制是基于其作用方式和所选研究提出的评价问题，不代表所有同类材料都会出现相同缺陷。</w:t>
+        <w:t>打印结构还会改变液体接触面积和传递路径，因而相同配方制成致密膜或开放结构后，应分别检查释放与湿态力学。表1归纳了几类路线需要优先控制的工艺环节。</w:t>
       </w:r>
     </w:p>
     <w:p>
@@ -839,7 +839,7 @@
     </w:p>
     <w:p>
       <w:r>
-        <w:t>释放型敷料通过活性成分从网络向界面迁移实现抗菌，其关键是释放过程与局部作用条件是否匹配。陈述“负载抗菌物质”不足以解释效果，需要记录负载方式、可释放部分、介质组成和作用时间。例如，Chen等的打印壳聚糖/纳米管体系负载左氧氟沙星，由材料递送药物；其抗菌结果应结合药物与网络共同分析，而不能全部归因于壳聚糖或打印结构。</w:t>
+        <w:t>释放型敷料要经历活性组分从网络内部向液体及创面界面迁移的过程。以Chen等的壳聚糖/纳米管打印体系为例，左氧氟沙星由复合材料递送，药物、基体和制品结构共同影响作用过程。讨论这类材料时，应先分清药物怎样装载、是否与网络发生相互作用，再看释放曲线，而不是从总装载量直接推断抗菌持续时间。</w:t>
       </w:r>
       <w:r>
         <w:rPr>
@@ -852,7 +852,7 @@
     </w:p>
     <w:p>
       <w:r>
-        <w:t>金属或金属相关组分可能通过不同路径影响微生物，包括离子作用、膜相互作用和氧化过程。Liang等的抗菌敷料综述分别讨论了相关材料和机制，但不同物质不能用同一种机制概括。网络对成分的约束、离子环境和蛋白相互作用还可能影响实际暴露。因此，设计上需同时考察有效作用和宿主组织影响，不能把更多活性成分直接视为更高的综合性能。</w:t>
+        <w:t>从传质角度看，迁移距离、网络水合程度及活性组分与基体的结合都值得关注。若增厚敷料，内部组分到达界面的路径随之改变；若为了增强力学而提高网络约束，也可能改变释放过程。金属相关组分还涉及离子作用、膜相互作用或氧化过程，具体路径取决于物质及环境。相关综述对这些机制分别进行了讨论。</w:t>
       </w:r>
       <w:r>
         <w:rPr>
@@ -865,7 +865,7 @@
     </w:p>
     <w:p>
       <w:r>
-        <w:t>对于药物递送体系，累计释放曲线提供的是特定介质中的信息。液体体积、更新方式和活性物质稳定性会影响其解释。实验室释放数据可能指导材料筛选，但若要推断创面上的作用持续时间，还需要考虑渗出液交换和界面差异。持续释放也不自动意味着避免耐药性；相关主张必须有针对性的实验或临床证据。</w:t>
+        <w:t>累计释放实验应与使用情境相联系。介质体积、更新频率和活性物质稳定性会影响测得的曲线；创面渗出液不断交换时，界面浓度也会随之变化。因此，配方优化需要同时考虑初期暴露和后续供给。若只追求较高的累计释放量，可能忽视早期释放过快或后期供给不足的问题；这些应通过时间分辨的实验判断。</w:t>
       </w:r>
     </w:p>
     <w:p>
@@ -878,7 +878,7 @@
     </w:p>
     <w:p>
       <w:r>
-        <w:t>接触型策略强调材料界面的功能结构与微生物相互作用。前述刷状阳离子结构是把抗菌单元与增强组分结合的实例，其实际作用取决于功能结构是否能够接触微生物，而不是仅取决于材料中的总含量。对于带电结构，还需要考察测试环境及细胞相容性，避免把一种实验条件下的选择性扩展到所有接触情境。</w:t>
+        <w:t>接触型策略把抗菌结构固定在材料中，作用重点转向界面。前述纤维素表面的阳离子聚合物刷提供了一个清楚的设计思路：增强骨架保留在内部，抗菌单元分布在能够接触微生物的位置。分析固定化材料时，总含量之外还应关注表面暴露和吸液后的结构变化。埋在致密网络中的基团与伸展在界面的基团，即使化学组成相同，也未必有相同的接触机会。</w:t>
       </w:r>
       <w:r>
         <w:rPr>
@@ -891,7 +891,7 @@
     </w:p>
     <w:p>
       <w:r>
-        <w:t>Pranantyo等将阳离子聚咪唑鎓及N-乙酰半胱氨酸连接到PEG相关网络，分别承担抗菌/抗生物膜和抗氧化任务，并制备膜与纤维两种形态。该设计强调低浸出及固定化功能，在耐药菌生物膜感染的糖尿病小鼠创面模型中进行了评价。它提供了不同于持续释放或外部照射的设计思路，但低浸出不等于长期人体使用无风险，还需评估界面暴露和制品残留。</w:t>
+        <w:t>Pranantyo等把聚咪唑鎓和N-乙酰半胱氨酸连接到PEG相关网络，分别用于抗菌/抗生物膜和抗氧化，并制成膜与纤维。该设计强调低浸出，在耐药菌生物膜感染的糖尿病小鼠创面模型中进行了评价。固定化减少了对持续释放的依赖，也使功能保持更依赖表面状态：后续加工和浸泡是否改变界面，是这类材料值得追踪的问题。</w:t>
       </w:r>
       <w:r>
         <w:rPr>
@@ -904,7 +904,7 @@
     </w:p>
     <w:p>
       <w:r>
-        <w:t>需要注意，这篇研究于2025年发表作者更正，修改了部分图像、统计分析及角质细胞相关表述。本文联合阅读原文和更正，只用于讨论网络结构、抗生物膜路线及其模型范围，不采用受更正影响的人皮肤等效模型定量结果，也不把原先较强的再上皮化表述当作确定结论。</w:t>
+        <w:t>该论文于2025年发表作者更正，涉及部分图像、统计分析和角质细胞相关表述。本文按原文与更正共同讨论网络及抗生物膜路线，不引用受更正影响的人皮肤等效模型定量结果，也不采用原先较强的再上皮化表述。</w:t>
       </w:r>
       <w:r>
         <w:rPr>
@@ -925,7 +925,7 @@
     </w:p>
     <w:p>
       <w:r>
-        <w:t>光热策略通过吸收光并转化为热参与抗菌。Zeng等将聚多巴胺纳米颗粒引入黄原胶/魔芋葡甘聚糖体系，颗粒既与网络相互作用，也承担近红外光热转换功能；其体外抗菌与动物创面评价建立在相应照射条件下。由此可以看出，复合组分既可能影响工艺和力学，又可能影响抗菌，不应被描述为独立于网络的附加药物。</w:t>
+        <w:t>光热组分吸收光后把能量转化为热。Zeng等将聚多巴胺纳米颗粒引入黄原胶/魔芋葡甘聚糖体系，颗粒既参与网络相互作用，也承担近红外光热转换。这里的温升同时受吸光和散热影响：含水量、制品厚度、照射范围及周围液体都会改变热量分布。因而，工艺分析需要把颗粒分散与成型均匀性放在一起，避免局部富集带来不均匀受热。</w:t>
       </w:r>
       <w:r>
         <w:rPr>
@@ -938,7 +938,7 @@
     </w:p>
     <w:p>
       <w:r>
-        <w:t>Li等构建了单宁酸-铁修饰MoS₂纳米片复合水凝胶，将光热、过氧化物酶样及过氧化氢酶样活动与不同环境下的氧化过程联系起来；PVA、葡聚糖及相关组分通过动态硼酸酯作用形成网络。论文报告了依赖环境的催化及抗氧化行为，因此不能笼统写成材料既“产生ROS”又“清除ROS”而不说明条件。产生抗菌作用的过程与缓解组织氧化应激的过程，需要在阶段、位置和反应环境上区分。</w:t>
+        <w:t>Li等的单宁酸-铁修饰MoS₂复合体系更能说明反应环境的重要性。在酸性条件下，其过氧化物酶样活动催化过氧化氢产生羟基自由基；在中性条件下，过氧化氢酶样活动使过氧化氢分解产生氧。论文将前者主要归于MoS₂、后者主要归于单宁酸-铁结构，并报告中性环境下的抗氧化行为。PVA、葡聚糖及相关组分通过动态硼酸酯作用成网。由此分析，其功能组合的关键不是简单叠加“促氧化”和“抗氧化”，而是不同环境下反应路径的改变。</w:t>
       </w:r>
       <w:r>
         <w:rPr>
@@ -951,7 +951,7 @@
     </w:p>
     <w:p>
       <w:r>
-        <w:t>光动力策略则依赖光敏过程及相应活性物种，不能与光热机制混用名称。相关综述说明两类策略均可与水凝胶组合，但氧条件、光照范围和组织安全性仍需验证。本文所选原始实例主要用于光热及催化路线比较，不据此推定所有光动力材料的效果。不同研究若波长、辐照度和作用时间不一致，其抗菌结果不宜直接排序。</w:t>
+        <w:t>光动力与光热需要分开讨论。前者依赖光敏过程及相应活性物种，后者主要利用热效应。相关综述介绍了二者与水凝胶结合的路线。比较效果时，波长、辐照度、作用时间和温度过程是必要条件；光动力体系还要关注氧条件。这些参数应与网络组成一起记录，才有可能解释功能组分变化后的差异。</w:t>
       </w:r>
       <w:r>
         <w:rPr>
@@ -972,7 +972,7 @@
     </w:p>
     <w:p>
       <w:r>
-        <w:t>Yang Y等在2024年的研究中，将具有酸碱响应的复合纳米酶、包载乳酸氧化酶的敏感胶束和改性壳聚糖/氧化葡聚糖网络结合，利用细菌代谢微环境中的多因素变化构建级联抗菌及NO释放策略，并评价MRSA生物膜和感染运动创面。该方案把作用阶段纳入设计，反映了从恒定供给向条件触发的探索。其复杂性同时增加了组分制备、质量控制和作用归因的要求。</w:t>
+        <w:t>响应型材料尝试把活性过程与感染微环境联系起来。Yang Y等在2024年将酸碱响应复合纳米酶、包载乳酸氧化酶的敏感胶束及改性壳聚糖/氧化葡聚糖网络结合，设计级联抗菌及NO释放，并评价MRSA生物膜和感染运动创面。与恒定供给相比，级联路线增加了中间反应环节：前一步能否提供后一步所需条件，会影响整个作用过程。加工上还要确保各组分均匀分布并保持活性。</w:t>
       </w:r>
       <w:r>
         <w:rPr>
@@ -985,7 +985,7 @@
     </w:p>
     <w:p>
       <w:r>
-        <w:t>Zhao等的2025年研究把过氧化氢、多巴胺和GelMA组合为酶响应水凝胶，利用金黄色葡萄球菌相关过氧化氢酶促成的过程产生聚多巴胺和颜色变化，并将其与抗菌及光热处理连接。论文报告的检测用时为600 s，并在体外和动物模型中评价；作者也明确指出缺少临床验证。这一结果是所用模型中的检测表现，不是对临床感染诊断灵敏度、特异度或适用范围的保证。</w:t>
+        <w:t>Zhao等把过氧化氢、多巴胺和GelMA组合成酶响应水凝胶。金黄色葡萄球菌相关过氧化氢酶促使过氧化氢分解产氧，进而加快多巴胺向聚多巴胺的转变，出现颜色变化，并连接后续光热处理。论文报告检测用时为600 s，在体外和动物模型中进行了评价；作者明确指出尚缺临床验证。该路线把感染感知与材料内部反应结合起来，值得进一步考察的是多种创面成分共存时，颜色变化能否稳定反映目标过程。</w:t>
       </w:r>
       <w:r>
         <w:rPr>
@@ -998,7 +998,7 @@
     </w:p>
     <w:p>
       <w:r>
-        <w:t>“多机制”与“协同”也不能混为一谈。要判断组合是否超过相加作用，需要合适的单组分、空白网络、无刺激及组合对照。若只是完整复合物优于空白材料，能够支持组合设计有效，但尚不足以证明每个组分的独立贡献或严格的协同作用。综述应保留原研究的对照边界，不能在二次写作中将机制推测升级为实验证实。</w:t>
+        <w:t>对于多组分体系，删减组分的对照尤其重要。空白网络、单组分、无刺激和完整组合分别回答不同问题，可以帮助判断哪一步控制效果。若某一组分增加了制备难度，却没有带来可辨认的贡献，就有必要重新考虑它在配方中的位置。组合后效果提高与严格意义上的协同作用仍需区分。</w:t>
       </w:r>
     </w:p>
     <w:p>
@@ -1011,7 +1011,7 @@
     </w:p>
     <w:p>
       <w:r>
-        <w:t>抗生物膜需要区分预防初始附着、抑制形成及作用于成熟生物膜。普通悬浮菌试验不能覆盖所有这些问题。Pranantyo等研究针对耐药菌生物膜设置了评价，Yang等响应型研究也报告了MRSA生物膜相关实验，提供了比仅有悬浮菌终点更贴近相应感染模型的信息。即使如此，单菌种模型仍不能完整替代多菌种、具有组织环境差异的临床创面。</w:t>
+        <w:t>生物膜评价要说明作用发生在哪个阶段：预防初始附着、抑制形成，还是处理已经成熟的生物膜。成熟生物膜中的基质和空间分布增加了活性组分到达菌体的困难，这使材料表面接触与内部传递同样重要。Pranantyo等和Yang等分别针对耐药菌生物膜及MRSA生物膜设置实验，为讨论这些问题提供了具体对象。</w:t>
       </w:r>
       <w:r>
         <w:rPr>
@@ -1024,7 +1024,7 @@
     </w:p>
     <w:p>
       <w:r>
-        <w:t>评价还需区别“少附着”与“被杀灭”。只检测液相菌量，可能受到吸附和回收差异影响；只观察荧光或显微图像，也需要说明判读规则。应把附着、存活、回收和基质变化分别放入证据链，而不是用一个现象替代所有终点。本文据此比较研究的作用对象和模型，不拼接不同实验条件的抗菌率排行榜。</w:t>
+        <w:t>在实验读数上，应把“少附着”与“被杀灭”分开。材料吸附细菌后，液相菌量可能下降，但还需回收材料上的细菌判断存活；显微图像则能补充空间分布和基质变化。把活菌计数与结构观察结合起来，比单独使用一种终点更容易解释材料究竟改变了哪一个过程。</w:t>
       </w:r>
     </w:p>
     <w:p>
@@ -1045,7 +1045,7 @@
     </w:p>
     <w:p>
       <w:r>
-        <w:t>交联程度改变网络运动和结构约束，与吸液、溶胀、形状保持及组分传递发生联系。有关PVA及聚合物敷料的综述表明，这些指标会随配方和加工变化，但变化方向及幅度取决于具体体系。干态孔结构、平衡溶胀状态和创面服役中的湿态结构应区分，不能只依据干燥后的显微形貌推断所有传输行为。</w:t>
+        <w:t>水进入凝胶时，亲水链段的水合作用推动吸液，网络连接对链段伸展形成约束。调节交联结构，就会同时触及吸液量、形状保持和组分传递。PVA及聚合物敷料综述展示了配方和加工对这些指标的影响。实际评价应优先关注湿态网络：干燥后的孔形貌可以用于结构观察，但液体进入后网络会改变，传质条件也随之变化。</w:t>
       </w:r>
       <w:r>
         <w:rPr>
@@ -1058,7 +1058,7 @@
     </w:p>
     <w:p>
       <w:r>
-        <w:t>Zhang等2025年的水凝胶膜研究以四臂PEG的氨基和醛基形成席夫碱网络，引入单宁酸及抗菌β-肽聚合物。其工艺通过喷涂和溶剂蒸发促进成膜，液体管理与网络形成被同时纳入设计。该研究在MRSA感染糖尿病小鼠创面中观察菌负荷、渗出液和修复相关结果，说明成型方式与创面功能可以联合设计；但这仍是相应前临床模型的证据。</w:t>
+        <w:t>Zhang等2025年的膜研究采用四臂PEG的氨基和醛基形成席夫碱网络，加入单宁酸及抗菌β-肽聚合物。喷涂后，溶剂蒸发使聚合物逐步浓缩，增加链段接近和交联的机会。这一过程把铺展与成网联系起来：初始液体需要便于施用，随后又要形成稳定覆盖。论文在MRSA感染糖尿病小鼠创面中考察菌负荷、渗出液和修复相关结果，使成膜工艺与液体管理有了直接联系。</w:t>
       </w:r>
       <w:r>
         <w:rPr>
@@ -1071,7 +1071,7 @@
     </w:p>
     <w:p>
       <w:r>
-        <w:t>因此，吸液能力不是越大越好这一单向目标。需要检查吸液后是否保持覆盖、是否发生过度膨胀以及能否保持有效成分的作用状态。对较干燥与高渗出液创面，所需液体管理任务不同。合理的性能调控应先定义使用情境，再选择网络，而不是先确定一个最大溶胀值再寻找用途。</w:t>
+        <w:t>吸液指标应服务于创面任务。高渗出液情境更关注吸液后的完整性及液体滞留，较干燥的创面则需要保湿。过度膨胀还可能改变贴合状态和表面基团密度。配方筛选时，把溶胀、湿态尺寸、黏附和功能保持联合测试，比单独追求最大吸液量更有用。</w:t>
       </w:r>
       <w:r>
         <w:rPr>
@@ -1092,7 +1092,7 @@
     </w:p>
     <w:p>
       <w:r>
-        <w:t>拉伸强度、模量、韧性、压缩及循环疲劳回答不同问题，不能互相替代。刷状结构增强体系强调活动部位的覆盖与形变适应；动态网络体系强调破坏后的恢复。它们代表不同设计任务，不能只以某一个拉伸数字进行优劣判断。尤其是活动部位，反复形变后的完整性和功能保持比一次性实验终点更贴近使用过程。</w:t>
+        <w:t>活动部位的敷料既要承受形变，也要避免给皮肤带来过强的约束。拉伸强度反映承载的一方面，模量、韧性和循环后的恢复则分别涉及变形难度、破坏过程和反复使用。纤维骨架增强体系与双动态网络采用了不同办法：前者引入承载结构，后者利用可重组连接适应变化。比较时需要先看各自解决的力学问题。</w:t>
       </w:r>
       <w:r>
         <w:rPr>
@@ -1105,7 +1105,7 @@
     </w:p>
     <w:p>
       <w:r>
-        <w:t>Zhang等在同一膜体系中报告，改变单宁酸含量后，拉伸强度由(0.06 ± 0.01) MPa变为(0.2 ± 0.04) MPa，图注说明数据为均值±标准差，相关测试样本数为3。这里按原文保留数字精度，用于说明“组分变化与力学响应”在同一体系中的关联，不将其转换为跨论文的性能排名。单宁酸还参与其他相互作用，不能仅凭该对比推断所有功能随含量增加都单调改善。</w:t>
+        <w:t>Zhang等在同一膜体系中报告，改变单宁酸含量后，拉伸强度由(0.06 ± 0.01) MPa变为(0.2 ± 0.04) MPa，数据为均值±标准差，相关测试样本数为3。单宁酸提供额外相互作用，有助于理解组成与力学的联系。进一步优化时，还应检查增加这些连接后，铺展、吸液和湿态柔顺性是否保持合适。这里的数值用于分析同一体系的配方变化。</w:t>
       </w:r>
       <w:r>
         <w:rPr>
@@ -1118,7 +1118,7 @@
     </w:p>
     <w:p>
       <w:r>
-        <w:t>湿态黏附还与基底、液体、接触时间及测试方式有关。足够黏附有利于保持覆盖，但换药时的移除也是任务的一部分。Liang等的温度响应水凝胶利用海藻酸钠、明胶、原儿茶醛和Fe³⁺形成动态网络，讨论了重复黏附与局部温度控制下的重新定位。其主要用途包括切口封闭，不能与开放性感染创面敷料等同；它提供的是“可逆操作”设计思路，仍需针对不同创面进一步验证。</w:t>
+        <w:t>黏附还有施用与移除两个阶段。界面要保持覆盖，换药或重新定位时又希望便于操作。Liang等用海藻酸钠、明胶、原儿茶醛和Fe³⁺形成动态网络，将重复黏附与温度控制下的重新定位联系起来。其主要用途包括切口封闭，提供了可逆操作的思路；应用到开放性感染创面时，仍需另行考虑渗出液及创面界面。</w:t>
       </w:r>
       <w:r>
         <w:rPr>
@@ -1139,7 +1139,7 @@
     </w:p>
     <w:p>
       <w:r>
-        <w:t>抗菌效果与组织相容性应针对同一个最终制品状态评价。若抗菌测试使用未洗涤样品，而细胞测试使用充分洗涤样品，两项结果对应的实际暴露可能不同。释放液、浸提液和直接接触测试也回答不同问题。因此，读到“相容性良好”时，应查明细胞类型、处理方式、时间和对照，而不是直接将其写成所有条件下安全。</w:t>
+        <w:t>抗菌与组织相容性应在同一种成品状态下讨论。未洗涤样品和充分洗涤样品所提供的暴露不同，释放液、浸提液及直接接触测试也有各自用途。对工艺分析而言，洗涤不仅是样品准备步骤，还会改变可浸出成分和后续功能。因此，报告测试结果时应带上处理方式、接触时间及对照。</w:t>
       </w:r>
       <w:r>
         <w:rPr>
@@ -1152,7 +1152,7 @@
     </w:p>
     <w:p>
       <w:r>
-        <w:t>壳聚糖衍生物、阳离子聚合物、金属相关活性组分和光热材料均需要在各自的暴露条件下讨论。前述研究通常同时设置材料表征与生物学实验，提供了综合分析的基础，但细胞或血液相容性并不能替代长期植入、降解产物和患者使用评价。增加抗菌强度的设计是否压缩宿主组织可耐受范围，需进一步验证；不能把“非抗生素”当作无毒或不会产生其他不利影响的保证。</w:t>
+        <w:t>阳离子结构、金属相关组分和热效应能够影响微生物，也需要控制宿主组织的暴露。提高抗菌强度时，应检查组织可耐受范围是否随之收窄。固定化、控制释放或条件触发是不同的调节办法，选择哪一种，应结合界面位置和作用时间。壳聚糖衍生物、光交联体系及低浸出体系的研究提供了这些方面的实例；长期安全评价仍是另一项任务。</w:t>
       </w:r>
       <w:r>
         <w:rPr>
@@ -1173,7 +1173,7 @@
     </w:p>
     <w:p>
       <w:r>
-        <w:t>多功能敷料常将抗菌与氧化应激调节联系起来，但“清除某种自由基”“降低炎症相关信号”“促进创面闭合”是不同层次的结论。MoS₂相关体系通过环境依赖的催化过程处理这些任务，抗生物膜固定化体系则将不同功能基团连接在网络中。二者不能仅因为都使用“抗氧化”一词就视为同一种机制。</w:t>
+        <w:t>抗氧化功能需要联系具体反应来分析。MoS₂相关体系利用环境变化改变催化路径，固定化体系则把抗菌和抗氧化基团放在同一网络中。两者面对的问题相近，化学实现方式却不同：前者要控制反应条件及底物可及性，后者要关注功能基团的保留和接触。单独测得自由基清除能力，还应继续考察这一能力在吸液、储存和作用过程中能否保持。</w:t>
       </w:r>
       <w:r>
         <w:rPr>
@@ -1186,14 +1186,14 @@
     </w:p>
     <w:p>
       <w:r>
-        <w:t>对于创面修复，面积变化、组织学、菌负荷和血管相关指标也应分别呈现。所选原始研究提供了动物模型中的相关证据，支持材料继续研究，但不能据此宣布已改善患者预后。特别是糖尿病感染创面与一般急性创面的条件不同，结果外推应保留限定。皮肤等效模型虽然能补充组织相关信息，也不等于已完成患者临床评价。</w:t>
+        <w:t>修复评价可以沿过程来读：菌负荷反映感染控制，渗出液体现液体管理，组织学及面积变化提供修复信息。糖尿病感染创面与急性创面的条件不同，把这些终点连起来，才更容易判断材料改变了什么。本文采用的原始研究主要为体外及动物模型结果，模型局限在第5节集中说明。</w:t>
       </w:r>
       <w:r>
         <w:rPr>
           <w:sz w:val="18"/>
           <w:vertAlign w:val="superscript"/>
         </w:rPr>
-        <w:t>[2,15,20]</w:t>
+        <w:t>[2,20]</w:t>
       </w:r>
       <w:r/>
     </w:p>
@@ -1207,7 +1207,7 @@
     </w:p>
     <w:p>
       <w:r>
-        <w:t>最终产品的工艺链包括原料准备、成网、成型、后处理、灭菌、包装及储存。综述和所选原始研究提供了多种材料制备与功能验证思路，但本文没有取得证据证明这些候选配方均完成了这一整条链。因此，不能把一次性成胶实验写成成熟制造工艺，也不能把作者对“潜在临床应用”的讨论当作产品上市事实。</w:t>
+        <w:t>从实验样品走向制品，工艺链还包括后处理、灭菌、包装和储存。前驱液易混合、成胶速度快，只解决了其中一部分问题。多组分体系可能同时含有动态连接、酶或光响应组分，各部分对处理条件的耐受未必一致。因此，应以最终成品为对象，检查处理前后的结构、浸出物和功能，而不是沿用未经处理的小样结果。</w:t>
       </w:r>
       <w:r>
         <w:rPr>
@@ -1220,7 +1220,7 @@
     </w:p>
     <w:p>
       <w:r>
-        <w:t>对于预期移除的敷料，应关注使用期间完整性、残留和换药过程；对于预期降解的体系，应同时追踪产物、暴露和功能变化。灭菌或储存可能影响网络及活性组分，需要处理前后对照。工艺放大还涉及混合和反应均匀性、厚度分布、原料批次及浸出物控制。这些是本文提出的工艺评价要求，不是已经由所选材料逐一满足的条件。</w:t>
+        <w:t>放大时，混合与成网可能互相竞争：局部先成胶，会妨碍后续均匀分散；制品增厚，还会改变洗涤与传递路径。可优先考察加料顺序、混合时间、可操作时间及厚度分布。预期移除的敷料要保持使用期间完整性，预期降解的体系则需追踪产物及功能随时间的变化。根据这些要求安排质量控制，比仅记录“成功成胶”更接近化工生产的问题。</w:t>
       </w:r>
     </w:p>
     <w:p>
@@ -1241,7 +1241,7 @@
     </w:p>
     <w:p>
       <w:r>
-        <w:t>表2选取具有不同设计侧重的研究，比较网络、抗菌策略及应用模型。其目的在于呈现设计路径，而不是计算综合优劣分数。相同的“感染创面”表述仍可能对应不同菌种、宿主状态和损伤方式；模型名称不能代替实验条件。因此，表中定性结论均限制在论文所报告的模型内。</w:t>
+        <w:t>表2选取不同设计侧重的研究，将网络、抗菌策略和应用模型并列。阅读时可以先看材料面对什么任务，再看它用哪种结构解决问题。相同的感染创面名称仍可能对应不同菌种、宿主状态和损伤方式。</w:t>
       </w:r>
     </w:p>
     <w:p>
@@ -1895,7 +1895,7 @@
     </w:p>
     <w:p>
       <w:r>
-        <w:t>表2显示，近年的研究不仅讨论微生物控制，也讨论渗出液管理、感染感知和结构定制。2025年的成膜、酶响应和打印实例分别把加工简化、条件触发与成型自由度带入设计。不过，多项功能并存使作用归因更复杂；如果对照不足，就不能确定新增功能是否独立改善终点。这是研究比较中的共同分析问题，而不是对全部文献的统一否定。</w:t>
+        <w:t>这些研究中，成膜、酶响应和打印分别改变了施用方式、触发过程与结构成型。三者的化工关注点也不同：喷涂成膜要平衡铺展和浓缩成网，酶响应要保持反应组分活性，打印则要协调流动和沉积后支撑。与其用功能数量判断进展，不如看新工艺是否解决了原有使用或加工问题。</w:t>
       </w:r>
       <w:r>
         <w:rPr>
@@ -1916,7 +1916,7 @@
     </w:p>
     <w:p>
       <w:r>
-        <w:t>比较抗菌表现时，至少应记录菌种及菌株、起始接种、培养介质、材料用量、接触方式、作用时间、回收方法与终点；外部刺激体系还需记录刺激条件。抑菌圈依赖活性成分扩散，而接触型材料不一定产生相同表现，不能仅凭圈大小评价所有策略。活菌计数、显微观察和染色可以互补，但不应在没有解释的情况下互换指标名称。</w:t>
+        <w:t>抗菌数据的比较应先对齐菌种及菌株、接种、介质、材料用量、接触方式、时间和回收方法；光辅助体系还要对齐刺激条件。抑菌圈依赖活性成分扩散，适合讨论具有扩散作用的材料，却容易低估固定化接触策略。活菌计数、染色和显微观察各有侧重，应根据机制选择互补方法。</w:t>
       </w:r>
       <w:r>
         <w:rPr>
@@ -1929,7 +1929,7 @@
     </w:p>
     <w:p>
       <w:r>
-        <w:t>本报告仅使用已经从来源核对的少量工艺和力学数值，保留原文精度与测试语境，不把不同模型的抗菌百分比拼成排行榜。处理组、对照组和统计方式应先核对，再讨论差异。未报告或无法从全文确认的字段应保持缺失，不补一个看似合理的数值。特别是材料附着与菌回收之间的关系，可能需要专门对照才能判断。</w:t>
+        <w:t>本文保留已核对的工艺和力学数值，用于解释配方或过程变化，不将不同实验的抗菌百分比排成名次。对于材料吸附明显的体系，细菌回收尤其值得检查，否则液相菌量变化可能同时包含吸附和杀菌两种影响。缺失的测试条件也应保留为缺失，而不是补出一个推测值。</w:t>
       </w:r>
     </w:p>
     <w:p>
@@ -1942,12 +1942,7 @@
     </w:p>
     <w:p>
       <w:r>
-        <w:t>本稿参考文献的作者、题名、期刊、年卷期和页码或文章编号，均由实际取得的元数据核对。各DOI在Crossref有对应记录，DOI解析器返回有效跳转；这说明文献身份能够追踪，但不证明论文结论正确。论述仍需要与来源中的方法、结果和证据范围匹配，更正信息也必须处理。</w:t>
-      </w:r>
-    </w:p>
-    <w:p>
-      <w:r>
-        <w:t>Pranantyo等研究的更正是具体实例：作者修改了部分图像、统计分析及角质细胞相关措辞，并说明主要结论未改变。本文不独立复算其原始数据，也不把作者声明视为对所有结论的再验证；仅保留与本报告主题有关、未采用被更正定量数据的讨论，同时明确附列更正。该处理避免了只查DOI存在、不查实际引用内容的问题。</w:t>
+        <w:t>本稿通过实际取得的元数据核对作者、题名、期刊、年卷期及页码或文章编号，并检查DOI对应记录和解析跳转；具体论述与公开全文对照。文献身份可追踪与实验结论可信度属于不同问题。Pranantyo等的更正已随原文列入参考文献，相关处理见第3.2节。</w:t>
       </w:r>
       <w:r>
         <w:rPr>
@@ -1960,7 +1955,7 @@
     </w:p>
     <w:p>
       <w:r>
-        <w:t>本次选文偏向公开全文和与设计主线直接相关的研究，未完成所有材料的系统检索和正式风险偏倚评估，也没有进行统计合并。因此，本文的判断属于限定范围内的主题综合，不能宣称覆盖所有最新研究，不能据此断言某一种路线临床上最优。</w:t>
+        <w:t>选文偏向公开全文及与本报告设计主线相关的研究，未作系统检索、正式风险偏倚评估或统计合并。原始研究主要为体外及动物模型，包括感染、糖尿病创面和烧伤等具体情境。以下观点据此讨论材料设计与加工，不据此确定临床上最佳的敷料，也不把动物疼痛相关行为视为患者镇痛效果。</w:t>
       </w:r>
     </w:p>
     <w:p>
@@ -1981,7 +1976,7 @@
     </w:p>
     <w:p>
       <w:r>
-        <w:t>本文认为，材料的功能数量不是敷料价值的充分指标。烧伤、感染糖尿病创面、活动部位损伤和切口封闭分别提出不同任务；所选疼痛相关、抗生物膜、力学增强及可逆黏附研究说明，设计应与情境对应。把同一套多功能标签用于所有创面，可能掩盖实际需求的差异。</w:t>
+        <w:t>我认为，先确定敷料的主要任务，再选网络和抗菌方式，比先拼出多功能配方更合理。烧伤、感染糖尿病创面、活动部位损伤和切口封闭的要求并不相同。疼痛相关、抗生物膜、力学增强和可逆黏附研究各有侧重，这种针对性比统一的功能清单更有分析价值。</w:t>
       </w:r>
       <w:r>
         <w:rPr>
@@ -1994,7 +1989,7 @@
     </w:p>
     <w:p>
       <w:r>
-        <w:t>据此，可先明确创面情境及最关键的风险，再选择抗菌方式和网络。例如，高渗出液情境应把吸液后完整性和液体管理放在评价中心；需要外部照射的体系应检查设备与作用范围；活动部位则需要循环形变和覆盖保持。上述建议是本文基于文献比较提出的分析立场，并非已完成临床比较的治疗方案。</w:t>
+        <w:t>例如，高渗出液情境应优先检查吸液后的形状和覆盖；活动部位应关注循环形变后的完整性；外部照射体系则要把设备、照射范围和热量分布一起考虑。主要任务明确后，再决定是否需要加入其他功能，能够减少不必要的配方复杂度。</w:t>
       </w:r>
     </w:p>
     <w:p>
@@ -2007,7 +2002,7 @@
     </w:p>
     <w:p>
       <w:r>
-        <w:t>第二项观点是：性能优化应追求多个必要条件同时成立，而不是孤立极大值。抗菌与组织相容性、贴合与移除、网络稳定与液体交换可能在具体体系中互相牵制。单独改善一个指标后，还需检查其他必需性能是否保持可用。所选固定化功能、动态网络和成膜研究给出了不同解决路径，但没有证据表明存在适合所有情境的统一最佳配方。</w:t>
+        <w:t>配方优化更像是在多个约束之间找可用范围。增加网络连接可能提高稳定性，却也影响吸液和传递；增强界面作用有利于贴合，也要照顾移除操作。固定化功能、动态网络和喷涂成膜分别提供了不同解决办法，优化目标应落在最终制品的整体表现上。</w:t>
       </w:r>
       <w:r>
         <w:rPr>
@@ -2020,7 +2015,7 @@
     </w:p>
     <w:p>
       <w:r>
-        <w:t>因此，研究应尽量在同一最终制品、相近暴露条件下进行多项验证。可采用评价矩阵列出使用要求、验证方法和证据缺口，而不隐藏尚未测试的环节。对复杂体系，合适的删减组分或无刺激对照有助于解释贡献，避免把所有改善都归因于某个最显眼的组分。</w:t>
+        <w:t>在具体研究中，我更倾向于先设定几项必要性能，再逐步调节关键变量，而不是同时更换多种组分。这样较容易看清配方变化与结果之间的联系。对于复杂体系，删减组分和无刺激对照也能帮助判断：哪些组分确实承担了任务，哪些只增加了工序。</w:t>
       </w:r>
     </w:p>
     <w:p>
@@ -2033,7 +2028,7 @@
     </w:p>
     <w:p>
       <w:r>
-        <w:t>第三项观点是：研究进展也可以体现在加工路线、结构成型和质量控制上。2025年的膜研究强调喷涂与蒸发成型，打印研究强调流变与结构保持，说明工艺本身可以成为创新对象。但是，简化实验步骤不等于已经完成灭菌、储存和规模化；结构可定制也不等于每一种打印结构都具有相同释放与力学性能。</w:t>
+        <w:t>加工改进本身也是研究进展。喷涂与蒸发成膜把施用和成网结合起来，打印则利用流变设计获得定制结构。评价这些路线时，应继续追问能否稳定控制膜厚或打印尺寸、批次变化是否影响功能，以及处理后是否仍保持性能。制品形态不同，质量控制的重点也应不同。</w:t>
       </w:r>
       <w:r>
         <w:rPr>
@@ -2046,7 +2041,7 @@
     </w:p>
     <w:p>
       <w:r>
-        <w:t>后续研究可围绕最终制品的批次一致性、处理后功能保持、长期暴露及合理临床对照展开。相关方向在本文选文中仍存在证据不足，但不能据此宣布整个领域从未研究。若要提出某一问题属于普遍研究空白，还需更广的检索和具体范围说明。对于感染响应体系，其响应是否具有足够特异性、是否能在多因素创面环境中稳定判读，以及是否改善实际使用决策，尤其需进一步验证。</w:t>
+        <w:t>后续工作可优先把混合、成网、后处理与功能测试衔接起来，建立配方和工艺条件到成品性能的对应关系。感染响应体系还需考察多因素环境下的响应稳定性：若信号容易受非目标因素影响，再复杂的反应级联也难以支持可靠使用。与继续增加功能相比，减少关键过程的不确定性更值得投入。</w:t>
       </w:r>
       <w:r>
         <w:rPr>
@@ -2067,12 +2062,12 @@
     </w:p>
     <w:p>
       <w:r>
-        <w:t>医用抗菌水凝胶创面敷料的研究，正将网络构筑、抗菌作用与界面性能更紧密地联系起来。物理和化学交联决定基本结构，动态网络和复合增强改善特定使用行为，成膜及打印扩展制品形态；释放、接触及光热或催化辅助机制则对传递、可及性和使用条件提出不同要求。性能调控必须同时考虑液体管理、力学、黏附和组织相容性，不能只比较单项抗菌终点。</w:t>
+        <w:t>医用抗菌水凝胶敷料的设计，需要把网络构筑、活性组分作用和界面使用联系起来。物理交联重在结构稳定与温度处理，光交联重在受光和反应均匀性，动态网络要协调重组能力与形状保持；复合增强、喷涂成膜及打印进一步改变了承载方式和传递路径。抗菌机制的选择也会反过来约束加工：释放型关注供给过程，接触型关注表面可及性，光热及催化路线关注能量或反应条件。</w:t>
       </w:r>
     </w:p>
     <w:p>
       <w:r>
-        <w:t>据本文选取并核对的资料，相关候选材料具有值得继续研究的设计思路，但原始证据主要来自体外及动物模型。本文建议以明确创面任务、多项必要性能的可用范围和可制造性作为综合判断依据。临床有效性、长期安全和可重复制造仍需进一步验证；不同论文的数字和结论应保留其来源与适用边界，才能形成有依据的研究进展评价。</w:t>
+        <w:t>据现有资料，更有价值的优化方向是围绕明确创面任务，在液体管理、力学、黏附、抗菌和组织相容性之间取得可用的平衡，并把这一平衡稳定地落实到成品。临床有效性、长期安全及可重复制造仍需进一步验证。对化工本科生而言，读懂配方之后还应追问它怎样被均匀混合、可靠成型和稳定保存，这也是评价研究进展的重要部分。</w:t>
       </w:r>
     </w:p>
     <w:p>

</xml_diff>

<commit_message>
Add chemical engineering models and refine report wording
</commit_message>
<xml_diff>
--- a/deliverables/医用抗菌水凝胶_课程报告.docx
+++ b/deliverables/医用抗菌水凝胶_课程报告.docx
@@ -34,7 +34,7 @@
     </w:p>
     <w:p>
       <w:r>
-        <w:t>抗菌水凝胶创面敷料的开发涉及高分子网络构筑、活性组分传递和组织界面管理。以公开全文文献为依据，从制备工艺、抗菌机制及性能调控三个层次梳理研究进展，比较物理交联、光引发交联、动态网络和复合成型的结构特点，分析释放型、接触型及外部刺激辅助型抗菌策略的作用边界。代表性研究表明，网络构筑与功能组分引入往往相互耦合，抗菌作用、机械稳定性、湿态黏附、渗出液管理和组织相容性需要联合评价。近年的探索从单项抗菌功能扩展到抗生物膜、氧化应激调节、感染响应和可定制成型，但所选原始研究主要提供体外及动物模型证据，尚不能直接证明临床疗效。基于比较提出，敷料优化应以具体创面需求为起点，优先确定多项必要性能的可用范围，再评估工艺复杂度、质量控制和使用限制，避免以功能数量或单项指标最大值代替整体有效性。文献中的实验结论按模型和测试条件限定，材料转化仍需进一步验证。</w:t>
+        <w:t>抗菌水凝胶用于创面敷料时，抗菌成分的选择与网络制备很难分开讨论。本文结合2021—2025年的公开全文文献，从交联、复合增强和成型工艺入手，梳理释放型、接触型及光热和催化辅助抗菌路线。重点分析网络结构怎样影响吸液、传质、力学和湿态黏附，并用扩散时间尺度、幂律流变模型及混合与成胶的时间尺度比较补充工艺讨论。不同路线各有侧重：动态连接有利于结构重组，固定化抗菌依赖界面可及性，喷涂和打印则改变施用方式及传递路径。本文认为，配方优化的重点是围绕具体创面任务协调必要性能，并稳定地制成成品。所选原始研究以体外及动物模型为主，临床效果仍需进一步验证。</w:t>
       </w:r>
     </w:p>
     <w:p>
@@ -125,7 +125,7 @@
     </w:p>
     <w:p>
       <w:r>
-        <w:t>值得关注的是官能团的分配。氨基用于与醛基形成席夫碱后，可供其他作用的游离氨基随之改变；改性还可能改变局部电荷和水合状态。对于同时依靠这些基团成网和抗菌的体系，增加交联剂不能只看成胶是否更快，还应检查网络中的功能位点是否仍然可及。与其把交联看成一道固定工序，不如把成网位点、抗菌位点和界面作用位点分别列清楚，再决定各组分的配比。</w:t>
+        <w:t>值得关注的是官能团的分配。氨基用于与醛基形成席夫碱后，可供其他作用的游离氨基随之改变；改性还可能改变局部电荷和水合状态。对于同时依靠这些基团成网和抗菌的体系，增加交联剂不能只看成胶是否更快，还应检查网络中的功能位点是否仍然可及。同一类官能团承担多项任务，意味着交联比例的改变也可能改变功能分配。</w:t>
       </w:r>
     </w:p>
     <w:p>
@@ -177,7 +177,7 @@
     </w:p>
     <w:p>
       <w:r>
-        <w:t>这一工艺最需要控制的是光照和反应的均匀性。小试薄层较容易受光，制品增厚后，光穿透和组分吸收可能使内外层的转化程度不同。放大时应同时记录前驱液配比、引发剂、光源条件和厚度，并检查残余反应物及后处理效果。该研究进行了细胞、血液相容性、止血及MRSA感染全层皮肤缺损模型评价，为配方的功能分工提供了依据；工艺上下一步应关注的是如何稳定得到相同的网络，而不只是把照射时间保持不变。</w:t>
+        <w:t>这一工艺最需要控制的是光照和反应的均匀性。小试薄层较容易受光，制品增厚后，光穿透和组分吸收可能使内外层的转化程度不同。放大时应同时记录前驱液配比、引发剂、光源条件和厚度，并检查残余反应物及后处理效果。该研究进行了细胞、血液相容性、止血及MRSA感染全层皮肤缺损模型评价。保持照射时间相同，并不意味着改变厚度后还能得到相同的网络。</w:t>
       </w:r>
       <w:r>
         <w:rPr>
@@ -224,7 +224,7 @@
     </w:p>
     <w:p>
       <w:r>
-        <w:t>动态连接也带来一个工艺上的矛盾：连接容易重排，有利于注射、贴合和破损恢复；但重排过快，可能影响长期承载和形状保持。对此，断裂样品重新接合的演示还不够，流变恢复、持续受力后的变形，以及浸泡和反复运动后的功能保持更有分析价值。网络调整的目标应是让它在加工时能流动、施用后能稳定覆盖，两阶段的要求并不相同。</w:t>
+        <w:t>动态连接也带来一个工艺上的矛盾：连接容易重排，有利于注射、贴合和破损恢复；但重排过快，可能影响长期承载和形状保持。对此，断裂样品重新接合的演示还不够，流变恢复、持续受力后的变形，以及浸泡和反复运动后的功能保持更有分析价值。加工时的流动性与施用后的稳定覆盖，恰好对应了动态网络的两种不同状态。</w:t>
       </w:r>
     </w:p>
     <w:p>
@@ -250,7 +250,7 @@
     </w:p>
     <w:p>
       <w:r>
-        <w:t>三维打印则把问题转向流变与沉积。墨水黏度太低，挤出后的结构容易失去支撑；黏度过高，又增加挤出难度。剪切变稀使墨水在喷嘴内较易流动，沉积后的恢复能力决定它能否保持形状。Chen等利用埃洛石纳米管与壳聚糖之间的氢键和静电作用改善墨水流变及结构保持，并负载左氧氟沙星。结合打印敷料综述来看，原料分散、挤出和后续结构稳定应作为连续的加工过程控制，不能只看打印图形是否清晰。</w:t>
+        <w:t>三维打印则把问题转向流变与沉积。墨水黏度太低，挤出后的结构容易失去支撑；黏度过高，又增加挤出难度。剪切变稀使墨水在喷嘴内较易流动，沉积后的恢复能力决定它能否保持形状。Chen等利用埃洛石纳米管与壳聚糖之间的氢键和静电作用改善墨水流变及结构保持，并负载左氧氟沙星。打印图形清晰只是成型结果，背后还涉及原料分散、挤出流动和沉积后的结构变化。</w:t>
       </w:r>
       <w:r>
         <w:rPr>
@@ -260,6 +260,256 @@
         <w:t>[12,13]</w:t>
       </w:r>
       <w:r/>
+    </w:p>
+    <w:p>
+      <w:r>
+        <w:t>剪切变稀可以用幂律模型作局部描述。在选定的剪切速率范围内，若忽略屈服应力，可写为：</w:t>
+      </w:r>
+    </w:p>
+    <w:p>
+      <w:pPr>
+        <w:keepNext/>
+        <w:spacing w:line="640" w:lineRule="exact"/>
+        <w:ind w:firstLine="0"/>
+        <w:jc w:val="center"/>
+      </w:pPr>
+      <m:oMath>
+        <m:r>
+          <m:t>τ</m:t>
+        </m:r>
+        <m:r>
+          <m:rPr>
+            <m:sty m:val="p"/>
+          </m:rPr>
+          <m:t>=</m:t>
+        </m:r>
+        <m:r>
+          <m:t>K</m:t>
+        </m:r>
+        <m:sSup>
+          <m:e>
+            <m:acc>
+              <m:accPr>
+                <m:chr m:val="̇"/>
+              </m:accPr>
+              <m:e>
+                <m:r>
+                  <m:t>γ</m:t>
+                </m:r>
+              </m:e>
+            </m:acc>
+          </m:e>
+          <m:sup>
+            <m:r>
+              <m:t>n</m:t>
+            </m:r>
+          </m:sup>
+        </m:sSup>
+      </m:oMath>
+    </w:p>
+    <w:p>
+      <w:pPr>
+        <w:keepNext/>
+        <w:spacing w:line="640" w:lineRule="exact"/>
+        <w:ind w:firstLine="0"/>
+        <w:jc w:val="center"/>
+      </w:pPr>
+      <m:oMath>
+        <m:sSub>
+          <m:e>
+            <m:r>
+              <m:t>η</m:t>
+            </m:r>
+          </m:e>
+          <m:sub>
+            <m:r>
+              <m:rPr>
+                <m:sty m:val="p"/>
+              </m:rPr>
+              <m:t>a</m:t>
+            </m:r>
+            <m:r>
+              <m:rPr>
+                <m:sty m:val="p"/>
+              </m:rPr>
+              <m:t>p</m:t>
+            </m:r>
+            <m:r>
+              <m:rPr>
+                <m:sty m:val="p"/>
+              </m:rPr>
+              <m:t>p</m:t>
+            </m:r>
+          </m:sub>
+        </m:sSub>
+        <m:r>
+          <m:rPr>
+            <m:sty m:val="p"/>
+          </m:rPr>
+          <m:t>=</m:t>
+        </m:r>
+        <m:f>
+          <m:fPr>
+            <m:type m:val="bar"/>
+          </m:fPr>
+          <m:num>
+            <m:r>
+              <m:t>τ</m:t>
+            </m:r>
+          </m:num>
+          <m:den>
+            <m:acc>
+              <m:accPr>
+                <m:chr m:val="̇"/>
+              </m:accPr>
+              <m:e>
+                <m:r>
+                  <m:t>γ</m:t>
+                </m:r>
+              </m:e>
+            </m:acc>
+          </m:den>
+        </m:f>
+        <m:r>
+          <m:rPr>
+            <m:sty m:val="p"/>
+          </m:rPr>
+          <m:t>=</m:t>
+        </m:r>
+        <m:r>
+          <m:t>K</m:t>
+        </m:r>
+        <m:sSup>
+          <m:e>
+            <m:acc>
+              <m:accPr>
+                <m:chr m:val="̇"/>
+              </m:accPr>
+              <m:e>
+                <m:r>
+                  <m:t>γ</m:t>
+                </m:r>
+              </m:e>
+            </m:acc>
+          </m:e>
+          <m:sup>
+            <m:r>
+              <m:t>n</m:t>
+            </m:r>
+            <m:r>
+              <m:rPr>
+                <m:sty m:val="p"/>
+              </m:rPr>
+              <m:t>−</m:t>
+            </m:r>
+            <m:r>
+              <m:t>1</m:t>
+            </m:r>
+          </m:sup>
+        </m:sSup>
+      </m:oMath>
+    </w:p>
+    <w:p>
+      <w:r>
+        <w:t>其中，</w:t>
+      </w:r>
+      <m:oMath>
+        <m:r>
+          <m:t>τ</m:t>
+        </m:r>
+      </m:oMath>
+      <w:r>
+        <w:t xml:space="preserve"> 为剪切应力，单位为Pa；</w:t>
+      </w:r>
+      <m:oMath>
+        <m:acc>
+          <m:accPr>
+            <m:chr m:val="̇"/>
+          </m:accPr>
+          <m:e>
+            <m:r>
+              <m:t>γ</m:t>
+            </m:r>
+          </m:e>
+        </m:acc>
+      </m:oMath>
+      <w:r>
+        <w:t xml:space="preserve"> 为剪切速率，单位为s⁻¹；</w:t>
+      </w:r>
+      <m:oMath>
+        <m:r>
+          <m:t>K</m:t>
+        </m:r>
+      </m:oMath>
+      <w:r>
+        <w:t xml:space="preserve"> 为稠度系数，单位为Pa·sⁿ；</w:t>
+      </w:r>
+      <m:oMath>
+        <m:r>
+          <m:t>n</m:t>
+        </m:r>
+      </m:oMath>
+      <w:r>
+        <w:t xml:space="preserve"> 为无量纲流动指数；</w:t>
+      </w:r>
+      <m:oMath>
+        <m:sSub>
+          <m:e>
+            <m:r>
+              <m:t>η</m:t>
+            </m:r>
+          </m:e>
+          <m:sub>
+            <m:r>
+              <m:rPr>
+                <m:sty m:val="p"/>
+              </m:rPr>
+              <m:t>a</m:t>
+            </m:r>
+            <m:r>
+              <m:rPr>
+                <m:sty m:val="p"/>
+              </m:rPr>
+              <m:t>p</m:t>
+            </m:r>
+            <m:r>
+              <m:rPr>
+                <m:sty m:val="p"/>
+              </m:rPr>
+              <m:t>p</m:t>
+            </m:r>
+          </m:sub>
+        </m:sSub>
+      </m:oMath>
+      <w:r>
+        <w:t xml:space="preserve"> 为表观黏度，单位为Pa·s。当</w:t>
+      </w:r>
+      <m:oMath>
+        <m:r>
+          <m:t>0</m:t>
+        </m:r>
+        <m:r>
+          <m:rPr>
+            <m:sty m:val="p"/>
+          </m:rPr>
+          <m:t>&lt;</m:t>
+        </m:r>
+        <m:r>
+          <m:t>n</m:t>
+        </m:r>
+        <m:r>
+          <m:rPr>
+            <m:sty m:val="p"/>
+          </m:rPr>
+          <m:t>&lt;</m:t>
+        </m:r>
+        <m:r>
+          <m:t>1</m:t>
+        </m:r>
+      </m:oMath>
+      <w:r>
+        <w:t xml:space="preserve"> 时，剪切速率增大，表观黏度降低，能够解释墨水在喷嘴内较易流动的原因。但这一稳态关系没有包含沉积后的时间依赖恢复，也不能单独判断自支撑。这里用模型解释加工，未对Chen等的体系拟合参数。</w:t>
+      </w:r>
     </w:p>
     <w:p>
       <w:r>
@@ -865,7 +1115,158 @@
     </w:p>
     <w:p>
       <w:r>
-        <w:t>累计释放实验应与使用情境相联系。介质体积、更新频率和活性物质稳定性会影响测得的曲线；创面渗出液不断交换时，界面浓度也会随之变化。因此，配方优化需要同时考虑初期暴露和后续供给。若只追求较高的累计释放量，可能忽视早期释放过快或后期供给不足的问题；这些应通过时间分辨的实验判断。</w:t>
+        <w:t>若把敷料近似为均匀平板，以一维扩散为主，并暂不考虑溶胀、降解和结合反应，扩散方程中的时间项与空间项给出特征时间尺度：</w:t>
+      </w:r>
+    </w:p>
+    <w:p>
+      <w:pPr>
+        <w:keepNext/>
+        <w:spacing w:line="640" w:lineRule="exact"/>
+        <w:ind w:firstLine="0"/>
+        <w:jc w:val="center"/>
+      </w:pPr>
+      <m:oMath>
+        <m:sSub>
+          <m:e>
+            <m:r>
+              <m:t>t</m:t>
+            </m:r>
+          </m:e>
+          <m:sub>
+            <m:r>
+              <m:t>D</m:t>
+            </m:r>
+          </m:sub>
+        </m:sSub>
+        <m:r>
+          <m:rPr>
+            <m:sty m:val="p"/>
+          </m:rPr>
+          <m:t>∼</m:t>
+        </m:r>
+        <m:f>
+          <m:fPr>
+            <m:type m:val="bar"/>
+          </m:fPr>
+          <m:num>
+            <m:sSup>
+              <m:e>
+                <m:r>
+                  <m:t>L</m:t>
+                </m:r>
+              </m:e>
+              <m:sup>
+                <m:r>
+                  <m:t>2</m:t>
+                </m:r>
+              </m:sup>
+            </m:sSup>
+          </m:num>
+          <m:den>
+            <m:sSub>
+              <m:e>
+                <m:r>
+                  <m:t>D</m:t>
+                </m:r>
+              </m:e>
+              <m:sub>
+                <m:r>
+                  <m:rPr>
+                    <m:sty m:val="p"/>
+                  </m:rPr>
+                  <m:t>e</m:t>
+                </m:r>
+                <m:r>
+                  <m:rPr>
+                    <m:sty m:val="p"/>
+                  </m:rPr>
+                  <m:t>f</m:t>
+                </m:r>
+                <m:r>
+                  <m:rPr>
+                    <m:sty m:val="p"/>
+                  </m:rPr>
+                  <m:t>f</m:t>
+                </m:r>
+              </m:sub>
+            </m:sSub>
+          </m:den>
+        </m:f>
+      </m:oMath>
+    </w:p>
+    <w:p>
+      <w:r>
+        <w:t>其中，</w:t>
+      </w:r>
+      <m:oMath>
+        <m:sSub>
+          <m:e>
+            <m:r>
+              <m:t>t</m:t>
+            </m:r>
+          </m:e>
+          <m:sub>
+            <m:r>
+              <m:t>D</m:t>
+            </m:r>
+          </m:sub>
+        </m:sSub>
+      </m:oMath>
+      <w:r>
+        <w:t xml:space="preserve"> 的单位为s，</w:t>
+      </w:r>
+      <m:oMath>
+        <m:r>
+          <m:t>L</m:t>
+        </m:r>
+      </m:oMath>
+      <w:r>
+        <w:t xml:space="preserve"> 为有效扩散距离，单位为m，</w:t>
+      </w:r>
+      <m:oMath>
+        <m:sSub>
+          <m:e>
+            <m:r>
+              <m:t>D</m:t>
+            </m:r>
+          </m:e>
+          <m:sub>
+            <m:r>
+              <m:rPr>
+                <m:sty m:val="p"/>
+              </m:rPr>
+              <m:t>e</m:t>
+            </m:r>
+            <m:r>
+              <m:rPr>
+                <m:sty m:val="p"/>
+              </m:rPr>
+              <m:t>f</m:t>
+            </m:r>
+            <m:r>
+              <m:rPr>
+                <m:sty m:val="p"/>
+              </m:rPr>
+              <m:t>f</m:t>
+            </m:r>
+          </m:sub>
+        </m:sSub>
+      </m:oMath>
+      <w:r>
+        <w:t xml:space="preserve"> 为有效扩散系数，单位为m²·s⁻¹。在边界条件和有效扩散系数近似不变时，扩散距离增加到原来的2倍，特征时间约变为4倍。这是尺度推论，并非某篇论文测得的释放时间；</w:t>
+      </w:r>
+      <m:oMath>
+        <m:r>
+          <m:t>L</m:t>
+        </m:r>
+      </m:oMath>
+      <w:r>
+        <w:t xml:space="preserve"> 也要按单面或双面释放确定。对发生明显溶胀或强结合的网络，实际过程会偏离这一简化关系。厚度由此成为影响供给过程的变量，而不只是成品尺寸。</w:t>
+      </w:r>
+    </w:p>
+    <w:p>
+      <w:r>
+        <w:t>累计释放实验应与使用情境相联系。介质体积、更新频率和活性物质稳定性会影响测得的曲线；创面渗出液不断交换时，界面浓度也会随之变化。因此，配方优化需要同时考虑初期暴露和后续供给。相同的累计释放量可能来自不同的时间分布，早期集中释放与后期稳定供给对应的界面暴露并不相同。</w:t>
       </w:r>
     </w:p>
     <w:p>
@@ -998,7 +1399,7 @@
     </w:p>
     <w:p>
       <w:r>
-        <w:t>对于多组分体系，删减组分的对照尤其重要。空白网络、单组分、无刺激和完整组合分别回答不同问题，可以帮助判断哪一步控制效果。若某一组分增加了制备难度，却没有带来可辨认的贡献，就有必要重新考虑它在配方中的位置。组合后效果提高与严格意义上的协同作用仍需区分。</w:t>
+        <w:t>复杂配方也更难解释结果。完整组合优于空白网络，只说明组合产生了作用；单组分和无刺激对照才能进一步辨认贡献。若某一组分增加了制备难度，作用却始终难以分辨，它在配方中的必要性就成了问题。</w:t>
       </w:r>
     </w:p>
     <w:p>
@@ -1220,12 +1621,127 @@
     </w:p>
     <w:p>
       <w:r>
-        <w:t>放大时，混合与成网可能互相竞争：局部先成胶，会妨碍后续均匀分散；制品增厚，还会改变洗涤与传递路径。可优先考察加料顺序、混合时间、可操作时间及厚度分布。预期移除的敷料要保持使用期间完整性，预期降解的体系则需追踪产物及功能随时间的变化。根据这些要求安排质量控制，比仅记录“成功成胶”更接近化工生产的问题。</w:t>
+        <w:t>放大时，混合与成网可能互相竞争。对混合后即开始交联、并要求整体均匀的体系，可将达到组成均匀所需时间记为</w:t>
+      </w:r>
+      <m:oMath>
+        <m:sSub>
+          <m:e>
+            <m:r>
+              <m:t>t</m:t>
+            </m:r>
+          </m:e>
+          <m:sub>
+            <m:r>
+              <m:t>m</m:t>
+            </m:r>
+          </m:sub>
+        </m:sSub>
+      </m:oMath>
+      <w:r>
+        <w:t>，将相同工艺条件下从开始反应到成胶的时间记为</w:t>
+      </w:r>
+      <m:oMath>
+        <m:sSub>
+          <m:e>
+            <m:r>
+              <m:t>t</m:t>
+            </m:r>
+          </m:e>
+          <m:sub>
+            <m:r>
+              <m:t>g</m:t>
+            </m:r>
+          </m:sub>
+        </m:sSub>
+      </m:oMath>
+      <w:r>
+        <w:t>，两者单位均为s。定义无量纲时间尺度比：</w:t>
+      </w:r>
+    </w:p>
+    <w:p>
+      <w:pPr>
+        <w:keepNext/>
+        <w:spacing w:line="640" w:lineRule="exact"/>
+        <w:ind w:firstLine="0"/>
+        <w:jc w:val="center"/>
+      </w:pPr>
+      <m:oMath>
+        <m:sSub>
+          <m:e>
+            <m:r>
+              <m:t>Π</m:t>
+            </m:r>
+          </m:e>
+          <m:sub>
+            <m:r>
+              <m:t>m</m:t>
+            </m:r>
+          </m:sub>
+        </m:sSub>
+        <m:r>
+          <m:rPr>
+            <m:sty m:val="p"/>
+          </m:rPr>
+          <m:t>=</m:t>
+        </m:r>
+        <m:f>
+          <m:fPr>
+            <m:type m:val="bar"/>
+          </m:fPr>
+          <m:num>
+            <m:sSub>
+              <m:e>
+                <m:r>
+                  <m:t>t</m:t>
+                </m:r>
+              </m:e>
+              <m:sub>
+                <m:r>
+                  <m:t>m</m:t>
+                </m:r>
+              </m:sub>
+            </m:sSub>
+          </m:num>
+          <m:den>
+            <m:sSub>
+              <m:e>
+                <m:r>
+                  <m:t>t</m:t>
+                </m:r>
+              </m:e>
+              <m:sub>
+                <m:r>
+                  <m:t>g</m:t>
+                </m:r>
+              </m:sub>
+            </m:sSub>
+          </m:den>
+        </m:f>
+        <m:r>
+          <m:rPr>
+            <m:sty m:val="p"/>
+          </m:rPr>
+          <m:t>≪</m:t>
+        </m:r>
+        <m:r>
+          <m:t>1</m:t>
+        </m:r>
+      </m:oMath>
+    </w:p>
+    <w:p>
+      <w:r>
+        <w:t>这个关系表示混合应明显快于成胶，是均匀制备的一个有利条件，并非充分条件。当两种时间尺度接近时，整体尚未混匀，局部就可能形成网络，随后分散变得困难。本稿未取得足以计算该比值的配套数据；对先混匀、后光照触发的路线，重点则转为照射前的均匀性与照射期间的空间差异，不能机械套用同一判据。</w:t>
+      </w:r>
+    </w:p>
+    <w:p>
+      <w:r>
+        <w:t>制品增厚还会改变洗涤与传递路径。预期移除的敷料强调使用期间完整性，预期降解的体系则涉及产物及功能随时间的变化。“成功成胶”只标志网络开始形成，与稳定制得可用敷料之间还有后处理和质量控制的距离。</w:t>
       </w:r>
     </w:p>
     <w:p>
       <w:pPr>
         <w:pStyle w:val="Heading1"/>
+        <w:pageBreakBefore/>
       </w:pPr>
       <w:r>
         <w:t>5 代表性研究比较与证据评价</w:t>
@@ -1247,7 +1763,6 @@
     <w:p>
       <w:pPr>
         <w:pStyle w:val="TableCaption"/>
-        <w:pageBreakBefore/>
       </w:pPr>
       <w:r>
         <w:t>表2  代表性原始研究的设计重点与证据边界</w:t>
@@ -2015,7 +2530,7 @@
     </w:p>
     <w:p>
       <w:r>
-        <w:t>在具体研究中，我更倾向于先设定几项必要性能，再逐步调节关键变量，而不是同时更换多种组分。这样较容易看清配方变化与结果之间的联系。对于复杂体系，删减组分和无刺激对照也能帮助判断：哪些组分确实承担了任务，哪些只增加了工序。</w:t>
+        <w:t>同时更换多种组分，容易使性能变化失去明确的对应关系。我更倾向于围绕一个关键变量逐步比较，例如先固定制品形态，再考察交联比例。这样得到的差异更容易回到网络结构和加工过程上解释。</w:t>
       </w:r>
     </w:p>
     <w:p>
@@ -2041,7 +2556,7 @@
     </w:p>
     <w:p>
       <w:r>
-        <w:t>后续工作可优先把混合、成网、后处理与功能测试衔接起来，建立配方和工艺条件到成品性能的对应关系。感染响应体系还需考察多因素环境下的响应稳定性：若信号容易受非目标因素影响，再复杂的反应级联也难以支持可靠使用。与继续增加功能相比，减少关键过程的不确定性更值得投入。</w:t>
+        <w:t>感染响应体系尤其能体现这个问题：如果信号容易受非目标因素影响，再复杂的反应级联也难以支持可靠使用。它的价值最终取决于复杂环境中的响应稳定性，而不只是反应步骤的数量。</w:t>
       </w:r>
       <w:r>
         <w:rPr>

</xml_diff>